<commit_message>
Use annual plan explanations for grade 10 and refresh reports
</commit_message>
<xml_diff>
--- a/reports/ksp/grade10/grade10-week01-ksp.docx
+++ b/reports/ksp/grade10/grade10-week01-ksp.docx
@@ -249,7 +249,7 @@
           </w:tcPr>
           <w:p>
             <w:r>
-              <w:t>Computer Hardware</w:t>
+              <w:t>Network Components, Cables and Connectors</w:t>
             </w:r>
           </w:p>
         </w:tc>
@@ -288,7 +288,7 @@
           </w:tcPr>
           <w:p>
             <w:r>
-              <w:t>Explain the core concepts of Computer Hardware using correct terminology. Identify key components, roles, or stages related to Computer Hardware. Analyze a real-world example where Computer Hardware is applied. Compare two representations or approaches within Computer Hardware. Apply Computer Hardware concepts to a short practical task or scenario.</w:t>
+              <w:t>Explain the core concepts of Network Components, Cables and Connectors using correct terminology. Identify key components, roles, or stages related to Network Components, Cables and Connectors. Analyze a real-world example where Network Components, Cables and Connectors is applied. Compare two representations or approaches within Network Components, Cables and Connectors. Apply Network Components, Cables and Connectors concepts to a short practical task or scenario.</w:t>
             </w:r>
           </w:p>
         </w:tc>
@@ -327,7 +327,7 @@
           </w:tcPr>
           <w:p>
             <w:r>
-              <w:t>Students will be able to: Explain the core concepts of Computer Hardware using correct terminology. Identify key components, roles, or stages related to Computer Hardware. Analyze a real-world example where Computer Hardware is applied. Compare two representations or approaches within Computer Hardware. Apply Computer Hardware concepts to a short practical task or scenario.</w:t>
+              <w:t>Students will be able to: Explain the core concepts of Network Components, Cables and Connectors using correct terminology. Identify key components, roles, or stages related to Network Components, Cables and Connectors. Analyze a real-world example where Network Components, Cables and Connectors is applied. Compare two representations or approaches within Network Components, Cables and Connectors. Apply Network Components, Cables and Connectors concepts to a short practical task or scenario.</w:t>
             </w:r>
           </w:p>
         </w:tc>
@@ -366,7 +366,7 @@
           </w:tcPr>
           <w:p>
             <w:r>
-              <w:t>Uses technical vocabulary accurately in explanations. Identifies correct components or stages of Computer Hardware. Provides a valid real-world example and justification. Completes the practice task with clear reasoning.</w:t>
+              <w:t>Uses technical vocabulary accurately in explanations. Identifies correct components or stages of Network Components, Cables and Connectors. Provides a valid real-world example and justification. Completes the practice task with clear reasoning.</w:t>
             </w:r>
           </w:p>
         </w:tc>
@@ -531,7 +531,7 @@
           </w:tcPr>
           <w:p>
             <w:r>
-              <w:t>Organizational stage (5 min): Starter: Present a short real-world case related to Computer Hardware (news, product, or school system). Ask guiding questions to activate prior knowledge. Teacher: Define Computer Hardware and outline the lesson goals. Students: Share what they already know or have used.</w:t>
+              <w:t>Organizational stage (5 min): Starter: Present a short real-world case related to Network Components, Cables and Connectors (news, product, or school system). Ask guiding questions to activate prior knowledge. Teacher: Define Network Components, Cables and Connectors and outline the lesson goals. Students: Share what they already know or have used.</w:t>
             </w:r>
           </w:p>
         </w:tc>
@@ -628,7 +628,7 @@
           </w:tcPr>
           <w:p>
             <w:r>
-              <w:t>New material (30 min): Explain the main concepts and components of Computer Hardware with a clear diagram. Show a real-world example and map it to the concepts. Discuss advantages, limitations, or common issues. Teacher: Model a simple analysis or walkthrough. Students: Take notes and answer quick concept checks. Case task: Students analyze a short scenario and identify how Computer Hardware is used. Small group: Build a mini summary (3-4 bullet points) of key ideas. Teacher: Provide feedback and clarify misconceptions.</w:t>
+              <w:t>New material (30 min): Explain the main concepts and components of Network Components, Cables and Connectors with a clear diagram. Show a real-world example and map it to the concepts. Discuss advantages, limitations, or common issues. Teacher: Model a simple analysis or walkthrough. Students: Take notes and answer quick concept checks. Case task: Students analyze a short scenario and identify how Network Components, Cables and Connectors is used. Small group: Build a mini summary (3-4 bullet points) of key ideas. Teacher: Provide feedback and clarify misconceptions.</w:t>
             </w:r>
           </w:p>
         </w:tc>
@@ -752,7 +752,7 @@
           </w:tcPr>
           <w:p>
             <w:r>
-              <w:t>Reflection (10 min): Which concept was most challenging for students? Which example worked best to explain Computer Hardware? What should be improved for the next lesson?</w:t>
+              <w:t>Reflection (10 min): Which concept was most challenging for students? Which example worked best to explain Network Components, Cables and Connectors? What should be improved for the next lesson?</w:t>
             </w:r>
           </w:p>
         </w:tc>
@@ -768,7 +768,7 @@
           </w:tcPr>
           <w:p>
             <w:r>
-              <w:t>Find a real-world case where Computer Hardware is used and write a 150-200 word summary. Create a one-page study sheet with definitions, components, and one diagram of Computer Hardware.</w:t>
+              <w:t>Find a real-world case where Network Components, Cables and Connectors is used and write a 150-200 word summary. Create a one-page study sheet with definitions, components, and one diagram of Network Components, Cables and Connectors.</w:t>
             </w:r>
           </w:p>
         </w:tc>

</xml_diff>